<commit_message>
feat: expand dashboard scope and add charting
- Integrate 14 new directorate dashboards
- Add Recharts for enhanced data visualization
- Update metadata and app navigation to reflect organizational expansion
</commit_message>
<xml_diff>
--- a/public/Kamus_KPI_Dashboard_Biro_Keuangan_dan_PDSI_BP_Batam.docx
+++ b/public/Kamus_KPI_Dashboard_Biro_Keuangan_dan_PDSI_BP_Batam.docx
@@ -51,7 +51,7 @@
           <w:sz w:val="18"/>
           <w:szCs w:val="18"/>
         </w:rPr>
-        <w:t xml:space="preserve">Unit Kerja: Biro Keuangan &amp; Pusat Data dan Sistem Informasi (PDSI) BP Batam | Cut-Off: April 2026</w:t>
+        <w:t xml:space="preserve">Unit Kerja: Konsolidasi Multi-Unit BP Batam | Cut-Off: April 2026</w:t>
       </w:r>
     </w:p>
     <w:p>
@@ -65,7 +65,7 @@
           <w:sz w:val="18"/>
           <w:szCs w:val="18"/>
         </w:rPr>
-        <w:t xml:space="preserve">Dokumen ini menyajikan kamus indikator kinerja dan formula kalkulasi resmi untuk unit Biro Keuangan dan Pusat Data dan Sistem Informasi (PDSI) BP Batam yang selaras dengan dokumen BP_Batam_KPI_Dictionary_Updated.pdf.</w:t>
+        <w:t xml:space="preserve">Dokumen ini menyajikan kamus indikator kinerja dan formula kalkulasi resmi untuk unit kerja BP Batam yang selaras dengan dokumen resmi BP Batam.</w:t>
       </w:r>
     </w:p>
     <w:tbl>
@@ -5187,6 +5187,1596 @@
                 <w:szCs w:val="16"/>
               </w:rPr>
               <w:t xml:space="preserve">Peak Bandwidth Terpakai (Gbps) ÷ Total Kapasitas Bandwidth Terpasang (Gbps) × 100%</w:t>
+            </w:r>
+          </w:p>
+        </w:tc>
+      </w:tr>
+      <w:tr>
+        <w:trPr>
+          <w:cantSplit/>
+        </w:trPr>
+        <w:tc>
+          <w:tcPr>
+            <w:tcW w:type="dxa" w:w="1800"/>
+            <w:shd w:fill="F8FAFC" w:val="clear"/>
+            <w:tcMar>
+              <w:top w:type="dxa" w:w="100"/>
+              <w:left w:type="dxa" w:w="120"/>
+              <w:bottom w:type="dxa" w:w="100"/>
+              <w:right w:type="dxa" w:w="120"/>
+            </w:tcMar>
+          </w:tcPr>
+          <w:p>
+            <w:r>
+              <w:rPr>
+                <w:rFonts w:ascii="Calibri" w:cs="Calibri" w:eastAsia="Calibri" w:hAnsi="Calibri"/>
+                <w:b/>
+                <w:bCs/>
+                <w:color w:val="0F172A"/>
+                <w:sz w:val="16"/>
+                <w:szCs w:val="16"/>
+              </w:rPr>
+              <w:t xml:space="preserve">PTSP / Kepuasan Pemohon</w:t>
+            </w:r>
+          </w:p>
+        </w:tc>
+        <w:tc>
+          <w:tcPr>
+            <w:tcW w:type="dxa" w:w="1800"/>
+            <w:shd w:fill="F8FAFC" w:val="clear"/>
+            <w:tcMar>
+              <w:top w:type="dxa" w:w="100"/>
+              <w:left w:type="dxa" w:w="120"/>
+              <w:bottom w:type="dxa" w:w="100"/>
+              <w:right w:type="dxa" w:w="120"/>
+            </w:tcMar>
+          </w:tcPr>
+          <w:p>
+            <w:pPr>
+              <w:jc w:val="center"/>
+            </w:pPr>
+            <w:r>
+              <w:rPr>
+                <w:rFonts w:ascii="Calibri" w:cs="Calibri" w:eastAsia="Calibri" w:hAnsi="Calibri"/>
+                <w:b/>
+                <w:bCs/>
+                <w:color w:val="0066CC"/>
+                <w:sz w:val="16"/>
+                <w:szCs w:val="16"/>
+              </w:rPr>
+              <w:t xml:space="preserve">IKSS_IKM</w:t>
+            </w:r>
+          </w:p>
+        </w:tc>
+        <w:tc>
+          <w:tcPr>
+            <w:tcW w:type="dxa" w:w="2800"/>
+            <w:shd w:fill="F8FAFC" w:val="clear"/>
+            <w:tcMar>
+              <w:top w:type="dxa" w:w="100"/>
+              <w:left w:type="dxa" w:w="120"/>
+              <w:bottom w:type="dxa" w:w="100"/>
+              <w:right w:type="dxa" w:w="120"/>
+            </w:tcMar>
+          </w:tcPr>
+          <w:p>
+            <w:r>
+              <w:rPr>
+                <w:rFonts w:ascii="Calibri" w:cs="Calibri" w:eastAsia="Calibri" w:hAnsi="Calibri"/>
+                <w:b/>
+                <w:bCs/>
+                <w:color w:val="0F172A"/>
+                <w:sz w:val="16"/>
+                <w:szCs w:val="16"/>
+              </w:rPr>
+              <w:t xml:space="preserve">Indeks Kepuasan Masyarakat (IKM) PTSP Permenpan RB</w:t>
+            </w:r>
+          </w:p>
+        </w:tc>
+        <w:tc>
+          <w:tcPr>
+            <w:tcW w:type="dxa" w:w="1600"/>
+            <w:shd w:fill="F8FAFC" w:val="clear"/>
+            <w:tcMar>
+              <w:top w:type="dxa" w:w="100"/>
+              <w:left w:type="dxa" w:w="120"/>
+              <w:bottom w:type="dxa" w:w="100"/>
+              <w:right w:type="dxa" w:w="120"/>
+            </w:tcMar>
+          </w:tcPr>
+          <w:p>
+            <w:pPr>
+              <w:jc w:val="center"/>
+            </w:pPr>
+            <w:r>
+              <w:rPr>
+                <w:rFonts w:ascii="Calibri" w:cs="Calibri" w:eastAsia="Calibri" w:hAnsi="Calibri"/>
+                <w:b/>
+                <w:bCs/>
+                <w:color w:val="15803D"/>
+                <w:sz w:val="16"/>
+                <w:szCs w:val="16"/>
+              </w:rPr>
+              <w:t xml:space="preserve">Executive</w:t>
+            </w:r>
+          </w:p>
+        </w:tc>
+        <w:tc>
+          <w:tcPr>
+            <w:tcW w:type="dxa" w:w="3600"/>
+            <w:shd w:fill="F8FAFC" w:val="clear"/>
+            <w:tcMar>
+              <w:top w:type="dxa" w:w="100"/>
+              <w:left w:type="dxa" w:w="120"/>
+              <w:bottom w:type="dxa" w:w="100"/>
+              <w:right w:type="dxa" w:w="120"/>
+            </w:tcMar>
+          </w:tcPr>
+          <w:p>
+            <w:r>
+              <w:rPr>
+                <w:rFonts w:ascii="Calibri" w:cs="Calibri" w:eastAsia="Calibri" w:hAnsi="Calibri"/>
+                <w:color w:val="334155"/>
+                <w:sz w:val="16"/>
+                <w:szCs w:val="16"/>
+              </w:rPr>
+              <w:t xml:space="preserve">Pengukuran tingkat kepuasan penerima layanan perizinan terpadu dan Mal Pelayanan Publik (MPP) BP Batam berpedoman pada 9 unsur Permenpan RB No. 14 Tahun 2017.</w:t>
+            </w:r>
+          </w:p>
+        </w:tc>
+        <w:tc>
+          <w:tcPr>
+            <w:tcW w:type="dxa" w:w="3800"/>
+            <w:shd w:fill="F8FAFC" w:val="clear"/>
+            <w:tcMar>
+              <w:top w:type="dxa" w:w="100"/>
+              <w:left w:type="dxa" w:w="120"/>
+              <w:bottom w:type="dxa" w:w="100"/>
+              <w:right w:type="dxa" w:w="120"/>
+            </w:tcMar>
+          </w:tcPr>
+          <w:p>
+            <w:r>
+              <w:rPr>
+                <w:rFonts w:ascii="Calibri" w:cs="Calibri" w:eastAsia="Calibri" w:hAnsi="Calibri"/>
+                <w:b/>
+                <w:bCs/>
+                <w:color w:val="0F172A"/>
+                <w:sz w:val="16"/>
+                <w:szCs w:val="16"/>
+              </w:rPr>
+              <w:t xml:space="preserve">SUM(Nilai Rata-Rata Unsur U1..U9 × 0,111) × 25 (Skala Konversi 0 - 100)</w:t>
+            </w:r>
+          </w:p>
+        </w:tc>
+      </w:tr>
+      <w:tr>
+        <w:trPr>
+          <w:cantSplit/>
+        </w:trPr>
+        <w:tc>
+          <w:tcPr>
+            <w:tcW w:type="dxa" w:w="1800"/>
+            <w:shd w:fill="FFFFFF" w:val="clear"/>
+            <w:tcMar>
+              <w:top w:type="dxa" w:w="100"/>
+              <w:left w:type="dxa" w:w="120"/>
+              <w:bottom w:type="dxa" w:w="100"/>
+              <w:right w:type="dxa" w:w="120"/>
+            </w:tcMar>
+          </w:tcPr>
+          <w:p>
+            <w:r>
+              <w:rPr>
+                <w:rFonts w:ascii="Calibri" w:cs="Calibri" w:eastAsia="Calibri" w:hAnsi="Calibri"/>
+                <w:b/>
+                <w:bCs/>
+                <w:color w:val="0F172A"/>
+                <w:sz w:val="16"/>
+                <w:szCs w:val="16"/>
+              </w:rPr>
+              <w:t xml:space="preserve">PTSP / Perizinan Berusaha</w:t>
+            </w:r>
+          </w:p>
+        </w:tc>
+        <w:tc>
+          <w:tcPr>
+            <w:tcW w:type="dxa" w:w="1800"/>
+            <w:shd w:fill="FFFFFF" w:val="clear"/>
+            <w:tcMar>
+              <w:top w:type="dxa" w:w="100"/>
+              <w:left w:type="dxa" w:w="120"/>
+              <w:bottom w:type="dxa" w:w="100"/>
+              <w:right w:type="dxa" w:w="120"/>
+            </w:tcMar>
+          </w:tcPr>
+          <w:p>
+            <w:pPr>
+              <w:jc w:val="center"/>
+            </w:pPr>
+            <w:r>
+              <w:rPr>
+                <w:rFonts w:ascii="Calibri" w:cs="Calibri" w:eastAsia="Calibri" w:hAnsi="Calibri"/>
+                <w:b/>
+                <w:bCs/>
+                <w:color w:val="0066CC"/>
+                <w:sz w:val="16"/>
+                <w:szCs w:val="16"/>
+              </w:rPr>
+              <w:t xml:space="preserve">LIC_SLA</w:t>
+            </w:r>
+          </w:p>
+        </w:tc>
+        <w:tc>
+          <w:tcPr>
+            <w:tcW w:type="dxa" w:w="2800"/>
+            <w:shd w:fill="FFFFFF" w:val="clear"/>
+            <w:tcMar>
+              <w:top w:type="dxa" w:w="100"/>
+              <w:left w:type="dxa" w:w="120"/>
+              <w:bottom w:type="dxa" w:w="100"/>
+              <w:right w:type="dxa" w:w="120"/>
+            </w:tcMar>
+          </w:tcPr>
+          <w:p>
+            <w:r>
+              <w:rPr>
+                <w:rFonts w:ascii="Calibri" w:cs="Calibri" w:eastAsia="Calibri" w:hAnsi="Calibri"/>
+                <w:b/>
+                <w:bCs/>
+                <w:color w:val="0F172A"/>
+                <w:sz w:val="16"/>
+                <w:szCs w:val="16"/>
+              </w:rPr>
+              <w:t xml:space="preserve">SLA Perizinan Tepat Waktu (SLA Compliance)</w:t>
+            </w:r>
+          </w:p>
+        </w:tc>
+        <w:tc>
+          <w:tcPr>
+            <w:tcW w:type="dxa" w:w="1600"/>
+            <w:shd w:fill="FFFFFF" w:val="clear"/>
+            <w:tcMar>
+              <w:top w:type="dxa" w:w="100"/>
+              <w:left w:type="dxa" w:w="120"/>
+              <w:bottom w:type="dxa" w:w="100"/>
+              <w:right w:type="dxa" w:w="120"/>
+            </w:tcMar>
+          </w:tcPr>
+          <w:p>
+            <w:pPr>
+              <w:jc w:val="center"/>
+            </w:pPr>
+            <w:r>
+              <w:rPr>
+                <w:rFonts w:ascii="Calibri" w:cs="Calibri" w:eastAsia="Calibri" w:hAnsi="Calibri"/>
+                <w:b/>
+                <w:bCs/>
+                <w:color w:val="15803D"/>
+                <w:sz w:val="16"/>
+                <w:szCs w:val="16"/>
+              </w:rPr>
+              <w:t xml:space="preserve">Executive</w:t>
+            </w:r>
+          </w:p>
+        </w:tc>
+        <w:tc>
+          <w:tcPr>
+            <w:tcW w:type="dxa" w:w="3600"/>
+            <w:shd w:fill="FFFFFF" w:val="clear"/>
+            <w:tcMar>
+              <w:top w:type="dxa" w:w="100"/>
+              <w:left w:type="dxa" w:w="120"/>
+              <w:bottom w:type="dxa" w:w="100"/>
+              <w:right w:type="dxa" w:w="120"/>
+            </w:tcMar>
+          </w:tcPr>
+          <w:p>
+            <w:r>
+              <w:rPr>
+                <w:rFonts w:ascii="Calibri" w:cs="Calibri" w:eastAsia="Calibri" w:hAnsi="Calibri"/>
+                <w:color w:val="334155"/>
+                <w:sz w:val="16"/>
+                <w:szCs w:val="16"/>
+              </w:rPr>
+              <w:t xml:space="preserve">Persentase permohonan perizinan berusaha OSS RBA dan non-perizinan yang diselesaikan tepat waktu sesuai standar pelayanan.</w:t>
+            </w:r>
+          </w:p>
+        </w:tc>
+        <w:tc>
+          <w:tcPr>
+            <w:tcW w:type="dxa" w:w="3800"/>
+            <w:shd w:fill="FFFFFF" w:val="clear"/>
+            <w:tcMar>
+              <w:top w:type="dxa" w:w="100"/>
+              <w:left w:type="dxa" w:w="120"/>
+              <w:bottom w:type="dxa" w:w="100"/>
+              <w:right w:type="dxa" w:w="120"/>
+            </w:tcMar>
+          </w:tcPr>
+          <w:p>
+            <w:r>
+              <w:rPr>
+                <w:rFonts w:ascii="Calibri" w:cs="Calibri" w:eastAsia="Calibri" w:hAnsi="Calibri"/>
+                <w:b/>
+                <w:bCs/>
+                <w:color w:val="0F172A"/>
+                <w:sz w:val="16"/>
+                <w:szCs w:val="16"/>
+              </w:rPr>
+              <w:t xml:space="preserve">SUM(IIF([Durasi Hari] &lt;= [Target SLA], 1, 0)) ÷ COUNT([Nomor Permohonan]) × 100%</w:t>
+            </w:r>
+          </w:p>
+        </w:tc>
+      </w:tr>
+      <w:tr>
+        <w:trPr>
+          <w:cantSplit/>
+        </w:trPr>
+        <w:tc>
+          <w:tcPr>
+            <w:tcW w:type="dxa" w:w="1800"/>
+            <w:shd w:fill="F8FAFC" w:val="clear"/>
+            <w:tcMar>
+              <w:top w:type="dxa" w:w="100"/>
+              <w:left w:type="dxa" w:w="120"/>
+              <w:bottom w:type="dxa" w:w="100"/>
+              <w:right w:type="dxa" w:w="120"/>
+            </w:tcMar>
+          </w:tcPr>
+          <w:p>
+            <w:r>
+              <w:rPr>
+                <w:rFonts w:ascii="Calibri" w:cs="Calibri" w:eastAsia="Calibri" w:hAnsi="Calibri"/>
+                <w:b/>
+                <w:bCs/>
+                <w:color w:val="0F172A"/>
+                <w:sz w:val="16"/>
+                <w:szCs w:val="16"/>
+              </w:rPr>
+              <w:t xml:space="preserve">PTSP / Perizinan Berusaha</w:t>
+            </w:r>
+          </w:p>
+        </w:tc>
+        <w:tc>
+          <w:tcPr>
+            <w:tcW w:type="dxa" w:w="1800"/>
+            <w:shd w:fill="F8FAFC" w:val="clear"/>
+            <w:tcMar>
+              <w:top w:type="dxa" w:w="100"/>
+              <w:left w:type="dxa" w:w="120"/>
+              <w:bottom w:type="dxa" w:w="100"/>
+              <w:right w:type="dxa" w:w="120"/>
+            </w:tcMar>
+          </w:tcPr>
+          <w:p>
+            <w:pPr>
+              <w:jc w:val="center"/>
+            </w:pPr>
+            <w:r>
+              <w:rPr>
+                <w:rFonts w:ascii="Calibri" w:cs="Calibri" w:eastAsia="Calibri" w:hAnsi="Calibri"/>
+                <w:b/>
+                <w:bCs/>
+                <w:color w:val="0066CC"/>
+                <w:sz w:val="16"/>
+                <w:szCs w:val="16"/>
+              </w:rPr>
+              <w:t xml:space="preserve">LIC_VOL</w:t>
+            </w:r>
+          </w:p>
+        </w:tc>
+        <w:tc>
+          <w:tcPr>
+            <w:tcW w:type="dxa" w:w="2800"/>
+            <w:shd w:fill="F8FAFC" w:val="clear"/>
+            <w:tcMar>
+              <w:top w:type="dxa" w:w="100"/>
+              <w:left w:type="dxa" w:w="120"/>
+              <w:bottom w:type="dxa" w:w="100"/>
+              <w:right w:type="dxa" w:w="120"/>
+            </w:tcMar>
+          </w:tcPr>
+          <w:p>
+            <w:r>
+              <w:rPr>
+                <w:rFonts w:ascii="Calibri" w:cs="Calibri" w:eastAsia="Calibri" w:hAnsi="Calibri"/>
+                <w:b/>
+                <w:bCs/>
+                <w:color w:val="0F172A"/>
+                <w:sz w:val="16"/>
+                <w:szCs w:val="16"/>
+              </w:rPr>
+              <w:t xml:space="preserve">Volume Total Permohonan Izin Masuk</w:t>
+            </w:r>
+          </w:p>
+        </w:tc>
+        <w:tc>
+          <w:tcPr>
+            <w:tcW w:type="dxa" w:w="1600"/>
+            <w:shd w:fill="F8FAFC" w:val="clear"/>
+            <w:tcMar>
+              <w:top w:type="dxa" w:w="100"/>
+              <w:left w:type="dxa" w:w="120"/>
+              <w:bottom w:type="dxa" w:w="100"/>
+              <w:right w:type="dxa" w:w="120"/>
+            </w:tcMar>
+          </w:tcPr>
+          <w:p>
+            <w:pPr>
+              <w:jc w:val="center"/>
+            </w:pPr>
+            <w:r>
+              <w:rPr>
+                <w:rFonts w:ascii="Calibri" w:cs="Calibri" w:eastAsia="Calibri" w:hAnsi="Calibri"/>
+                <w:b/>
+                <w:bCs/>
+                <w:color w:val="B45309"/>
+                <w:sz w:val="16"/>
+                <w:szCs w:val="16"/>
+              </w:rPr>
+              <w:t xml:space="preserve">Program Driver</w:t>
+            </w:r>
+          </w:p>
+        </w:tc>
+        <w:tc>
+          <w:tcPr>
+            <w:tcW w:type="dxa" w:w="3600"/>
+            <w:shd w:fill="F8FAFC" w:val="clear"/>
+            <w:tcMar>
+              <w:top w:type="dxa" w:w="100"/>
+              <w:left w:type="dxa" w:w="120"/>
+              <w:bottom w:type="dxa" w:w="100"/>
+              <w:right w:type="dxa" w:w="120"/>
+            </w:tcMar>
+          </w:tcPr>
+          <w:p>
+            <w:r>
+              <w:rPr>
+                <w:rFonts w:ascii="Calibri" w:cs="Calibri" w:eastAsia="Calibri" w:hAnsi="Calibri"/>
+                <w:color w:val="334155"/>
+                <w:sz w:val="16"/>
+                <w:szCs w:val="16"/>
+              </w:rPr>
+              <w:t xml:space="preserve">Akumulasi seluruh berkas permohonan izin berusaha, penanaman modal, pertanahan, dan maritim yang masuk ke PTSP BP Batam.</w:t>
+            </w:r>
+          </w:p>
+        </w:tc>
+        <w:tc>
+          <w:tcPr>
+            <w:tcW w:type="dxa" w:w="3800"/>
+            <w:shd w:fill="F8FAFC" w:val="clear"/>
+            <w:tcMar>
+              <w:top w:type="dxa" w:w="100"/>
+              <w:left w:type="dxa" w:w="120"/>
+              <w:bottom w:type="dxa" w:w="100"/>
+              <w:right w:type="dxa" w:w="120"/>
+            </w:tcMar>
+          </w:tcPr>
+          <w:p>
+            <w:r>
+              <w:rPr>
+                <w:rFonts w:ascii="Calibri" w:cs="Calibri" w:eastAsia="Calibri" w:hAnsi="Calibri"/>
+                <w:b/>
+                <w:bCs/>
+                <w:color w:val="0F172A"/>
+                <w:sz w:val="16"/>
+                <w:szCs w:val="16"/>
+              </w:rPr>
+              <w:t xml:space="preserve">COUNT([Nomor Permohonan Masuk]) YTD TA Berjalan</w:t>
+            </w:r>
+          </w:p>
+        </w:tc>
+      </w:tr>
+      <w:tr>
+        <w:trPr>
+          <w:cantSplit/>
+        </w:trPr>
+        <w:tc>
+          <w:tcPr>
+            <w:tcW w:type="dxa" w:w="1800"/>
+            <w:shd w:fill="FFFFFF" w:val="clear"/>
+            <w:tcMar>
+              <w:top w:type="dxa" w:w="100"/>
+              <w:left w:type="dxa" w:w="120"/>
+              <w:bottom w:type="dxa" w:w="100"/>
+              <w:right w:type="dxa" w:w="120"/>
+            </w:tcMar>
+          </w:tcPr>
+          <w:p>
+            <w:r>
+              <w:rPr>
+                <w:rFonts w:ascii="Calibri" w:cs="Calibri" w:eastAsia="Calibri" w:hAnsi="Calibri"/>
+                <w:b/>
+                <w:bCs/>
+                <w:color w:val="0F172A"/>
+                <w:sz w:val="16"/>
+                <w:szCs w:val="16"/>
+              </w:rPr>
+              <w:t xml:space="preserve">PTSP / Perizinan Berusaha</w:t>
+            </w:r>
+          </w:p>
+        </w:tc>
+        <w:tc>
+          <w:tcPr>
+            <w:tcW w:type="dxa" w:w="1800"/>
+            <w:shd w:fill="FFFFFF" w:val="clear"/>
+            <w:tcMar>
+              <w:top w:type="dxa" w:w="100"/>
+              <w:left w:type="dxa" w:w="120"/>
+              <w:bottom w:type="dxa" w:w="100"/>
+              <w:right w:type="dxa" w:w="120"/>
+            </w:tcMar>
+          </w:tcPr>
+          <w:p>
+            <w:pPr>
+              <w:jc w:val="center"/>
+            </w:pPr>
+            <w:r>
+              <w:rPr>
+                <w:rFonts w:ascii="Calibri" w:cs="Calibri" w:eastAsia="Calibri" w:hAnsi="Calibri"/>
+                <w:b/>
+                <w:bCs/>
+                <w:color w:val="0066CC"/>
+                <w:sz w:val="16"/>
+                <w:szCs w:val="16"/>
+              </w:rPr>
+              <w:t xml:space="preserve">LIC_ISSUED</w:t>
+            </w:r>
+          </w:p>
+        </w:tc>
+        <w:tc>
+          <w:tcPr>
+            <w:tcW w:type="dxa" w:w="2800"/>
+            <w:shd w:fill="FFFFFF" w:val="clear"/>
+            <w:tcMar>
+              <w:top w:type="dxa" w:w="100"/>
+              <w:left w:type="dxa" w:w="120"/>
+              <w:bottom w:type="dxa" w:w="100"/>
+              <w:right w:type="dxa" w:w="120"/>
+            </w:tcMar>
+          </w:tcPr>
+          <w:p>
+            <w:r>
+              <w:rPr>
+                <w:rFonts w:ascii="Calibri" w:cs="Calibri" w:eastAsia="Calibri" w:hAnsi="Calibri"/>
+                <w:b/>
+                <w:bCs/>
+                <w:color w:val="0F172A"/>
+                <w:sz w:val="16"/>
+                <w:szCs w:val="16"/>
+              </w:rPr>
+              <w:t xml:space="preserve">Rasio Efektivitas Penerbitan Izin (Issuance Ratio)</w:t>
+            </w:r>
+          </w:p>
+        </w:tc>
+        <w:tc>
+          <w:tcPr>
+            <w:tcW w:type="dxa" w:w="1600"/>
+            <w:shd w:fill="FFFFFF" w:val="clear"/>
+            <w:tcMar>
+              <w:top w:type="dxa" w:w="100"/>
+              <w:left w:type="dxa" w:w="120"/>
+              <w:bottom w:type="dxa" w:w="100"/>
+              <w:right w:type="dxa" w:w="120"/>
+            </w:tcMar>
+          </w:tcPr>
+          <w:p>
+            <w:pPr>
+              <w:jc w:val="center"/>
+            </w:pPr>
+            <w:r>
+              <w:rPr>
+                <w:rFonts w:ascii="Calibri" w:cs="Calibri" w:eastAsia="Calibri" w:hAnsi="Calibri"/>
+                <w:b/>
+                <w:bCs/>
+                <w:color w:val="0066CC"/>
+                <w:sz w:val="16"/>
+                <w:szCs w:val="16"/>
+              </w:rPr>
+              <w:t xml:space="preserve">Financial</w:t>
+            </w:r>
+          </w:p>
+        </w:tc>
+        <w:tc>
+          <w:tcPr>
+            <w:tcW w:type="dxa" w:w="3600"/>
+            <w:shd w:fill="FFFFFF" w:val="clear"/>
+            <w:tcMar>
+              <w:top w:type="dxa" w:w="100"/>
+              <w:left w:type="dxa" w:w="120"/>
+              <w:bottom w:type="dxa" w:w="100"/>
+              <w:right w:type="dxa" w:w="120"/>
+            </w:tcMar>
+          </w:tcPr>
+          <w:p>
+            <w:r>
+              <w:rPr>
+                <w:rFonts w:ascii="Calibri" w:cs="Calibri" w:eastAsia="Calibri" w:hAnsi="Calibri"/>
+                <w:color w:val="334155"/>
+                <w:sz w:val="16"/>
+                <w:szCs w:val="16"/>
+              </w:rPr>
+              <w:t xml:space="preserve">Rasio izin yang berhasil disetujui dan diterbitkan secara resmi terhadap total permohonan masuk.</w:t>
+            </w:r>
+          </w:p>
+        </w:tc>
+        <w:tc>
+          <w:tcPr>
+            <w:tcW w:type="dxa" w:w="3800"/>
+            <w:shd w:fill="FFFFFF" w:val="clear"/>
+            <w:tcMar>
+              <w:top w:type="dxa" w:w="100"/>
+              <w:left w:type="dxa" w:w="120"/>
+              <w:bottom w:type="dxa" w:w="100"/>
+              <w:right w:type="dxa" w:w="120"/>
+            </w:tcMar>
+          </w:tcPr>
+          <w:p>
+            <w:r>
+              <w:rPr>
+                <w:rFonts w:ascii="Calibri" w:cs="Calibri" w:eastAsia="Calibri" w:hAnsi="Calibri"/>
+                <w:b/>
+                <w:bCs/>
+                <w:color w:val="0F172A"/>
+                <w:sz w:val="16"/>
+                <w:szCs w:val="16"/>
+              </w:rPr>
+              <w:t xml:space="preserve">Jumlah Izin Berhasil Terbit ÷ Total Permohonan Masuk × 100%</w:t>
+            </w:r>
+          </w:p>
+        </w:tc>
+      </w:tr>
+      <w:tr>
+        <w:trPr>
+          <w:cantSplit/>
+        </w:trPr>
+        <w:tc>
+          <w:tcPr>
+            <w:tcW w:type="dxa" w:w="1800"/>
+            <w:shd w:fill="F8FAFC" w:val="clear"/>
+            <w:tcMar>
+              <w:top w:type="dxa" w:w="100"/>
+              <w:left w:type="dxa" w:w="120"/>
+              <w:bottom w:type="dxa" w:w="100"/>
+              <w:right w:type="dxa" w:w="120"/>
+            </w:tcMar>
+          </w:tcPr>
+          <w:p>
+            <w:r>
+              <w:rPr>
+                <w:rFonts w:ascii="Calibri" w:cs="Calibri" w:eastAsia="Calibri" w:hAnsi="Calibri"/>
+                <w:b/>
+                <w:bCs/>
+                <w:color w:val="0F172A"/>
+                <w:sz w:val="16"/>
+                <w:szCs w:val="16"/>
+              </w:rPr>
+              <w:t xml:space="preserve">PTSP / Operasional Layanan</w:t>
+            </w:r>
+          </w:p>
+        </w:tc>
+        <w:tc>
+          <w:tcPr>
+            <w:tcW w:type="dxa" w:w="1800"/>
+            <w:shd w:fill="F8FAFC" w:val="clear"/>
+            <w:tcMar>
+              <w:top w:type="dxa" w:w="100"/>
+              <w:left w:type="dxa" w:w="120"/>
+              <w:bottom w:type="dxa" w:w="100"/>
+              <w:right w:type="dxa" w:w="120"/>
+            </w:tcMar>
+          </w:tcPr>
+          <w:p>
+            <w:pPr>
+              <w:jc w:val="center"/>
+            </w:pPr>
+            <w:r>
+              <w:rPr>
+                <w:rFonts w:ascii="Calibri" w:cs="Calibri" w:eastAsia="Calibri" w:hAnsi="Calibri"/>
+                <w:b/>
+                <w:bCs/>
+                <w:color w:val="0066CC"/>
+                <w:sz w:val="16"/>
+                <w:szCs w:val="16"/>
+              </w:rPr>
+              <w:t xml:space="preserve">LIC_BACKLOG</w:t>
+            </w:r>
+          </w:p>
+        </w:tc>
+        <w:tc>
+          <w:tcPr>
+            <w:tcW w:type="dxa" w:w="2800"/>
+            <w:shd w:fill="F8FAFC" w:val="clear"/>
+            <w:tcMar>
+              <w:top w:type="dxa" w:w="100"/>
+              <w:left w:type="dxa" w:w="120"/>
+              <w:bottom w:type="dxa" w:w="100"/>
+              <w:right w:type="dxa" w:w="120"/>
+            </w:tcMar>
+          </w:tcPr>
+          <w:p>
+            <w:r>
+              <w:rPr>
+                <w:rFonts w:ascii="Calibri" w:cs="Calibri" w:eastAsia="Calibri" w:hAnsi="Calibri"/>
+                <w:b/>
+                <w:bCs/>
+                <w:color w:val="0F172A"/>
+                <w:sz w:val="16"/>
+                <w:szCs w:val="16"/>
+              </w:rPr>
+              <w:t xml:space="preserve">Backlog Permohonan / Pending Cases</w:t>
+            </w:r>
+          </w:p>
+        </w:tc>
+        <w:tc>
+          <w:tcPr>
+            <w:tcW w:type="dxa" w:w="1600"/>
+            <w:shd w:fill="F8FAFC" w:val="clear"/>
+            <w:tcMar>
+              <w:top w:type="dxa" w:w="100"/>
+              <w:left w:type="dxa" w:w="120"/>
+              <w:bottom w:type="dxa" w:w="100"/>
+              <w:right w:type="dxa" w:w="120"/>
+            </w:tcMar>
+          </w:tcPr>
+          <w:p>
+            <w:pPr>
+              <w:jc w:val="center"/>
+            </w:pPr>
+            <w:r>
+              <w:rPr>
+                <w:rFonts w:ascii="Calibri" w:cs="Calibri" w:eastAsia="Calibri" w:hAnsi="Calibri"/>
+                <w:b/>
+                <w:bCs/>
+                <w:color w:val="64748B"/>
+                <w:sz w:val="16"/>
+                <w:szCs w:val="16"/>
+              </w:rPr>
+              <w:t xml:space="preserve">Operational Driver</w:t>
+            </w:r>
+          </w:p>
+        </w:tc>
+        <w:tc>
+          <w:tcPr>
+            <w:tcW w:type="dxa" w:w="3600"/>
+            <w:shd w:fill="F8FAFC" w:val="clear"/>
+            <w:tcMar>
+              <w:top w:type="dxa" w:w="100"/>
+              <w:left w:type="dxa" w:w="120"/>
+              <w:bottom w:type="dxa" w:w="100"/>
+              <w:right w:type="dxa" w:w="120"/>
+            </w:tcMar>
+          </w:tcPr>
+          <w:p>
+            <w:r>
+              <w:rPr>
+                <w:rFonts w:ascii="Calibri" w:cs="Calibri" w:eastAsia="Calibri" w:hAnsi="Calibri"/>
+                <w:color w:val="334155"/>
+                <w:sz w:val="16"/>
+                <w:szCs w:val="16"/>
+              </w:rPr>
+              <w:t xml:space="preserve">Jumlah berkas permohonan perizinan yang masih dalam status verifikasi aktif dan belum diterbitkan.</w:t>
+            </w:r>
+          </w:p>
+        </w:tc>
+        <w:tc>
+          <w:tcPr>
+            <w:tcW w:type="dxa" w:w="3800"/>
+            <w:shd w:fill="F8FAFC" w:val="clear"/>
+            <w:tcMar>
+              <w:top w:type="dxa" w:w="100"/>
+              <w:left w:type="dxa" w:w="120"/>
+              <w:bottom w:type="dxa" w:w="100"/>
+              <w:right w:type="dxa" w:w="120"/>
+            </w:tcMar>
+          </w:tcPr>
+          <w:p>
+            <w:r>
+              <w:rPr>
+                <w:rFonts w:ascii="Calibri" w:cs="Calibri" w:eastAsia="Calibri" w:hAnsi="Calibri"/>
+                <w:b/>
+                <w:bCs/>
+                <w:color w:val="0F172A"/>
+                <w:sz w:val="16"/>
+                <w:szCs w:val="16"/>
+              </w:rPr>
+              <w:t xml:space="preserve">COUNT(IIF([Status] = "Dalam Proses", [Nomor Permohonan], NULL))</w:t>
+            </w:r>
+          </w:p>
+        </w:tc>
+      </w:tr>
+      <w:tr>
+        <w:trPr>
+          <w:cantSplit/>
+        </w:trPr>
+        <w:tc>
+          <w:tcPr>
+            <w:tcW w:type="dxa" w:w="1800"/>
+            <w:shd w:fill="FFFFFF" w:val="clear"/>
+            <w:tcMar>
+              <w:top w:type="dxa" w:w="100"/>
+              <w:left w:type="dxa" w:w="120"/>
+              <w:bottom w:type="dxa" w:w="100"/>
+              <w:right w:type="dxa" w:w="120"/>
+            </w:tcMar>
+          </w:tcPr>
+          <w:p>
+            <w:r>
+              <w:rPr>
+                <w:rFonts w:ascii="Calibri" w:cs="Calibri" w:eastAsia="Calibri" w:hAnsi="Calibri"/>
+                <w:b/>
+                <w:bCs/>
+                <w:color w:val="0F172A"/>
+                <w:sz w:val="16"/>
+                <w:szCs w:val="16"/>
+              </w:rPr>
+              <w:t xml:space="preserve">PTSP / Kecepatan Layanan</w:t>
+            </w:r>
+          </w:p>
+        </w:tc>
+        <w:tc>
+          <w:tcPr>
+            <w:tcW w:type="dxa" w:w="1800"/>
+            <w:shd w:fill="FFFFFF" w:val="clear"/>
+            <w:tcMar>
+              <w:top w:type="dxa" w:w="100"/>
+              <w:left w:type="dxa" w:w="120"/>
+              <w:bottom w:type="dxa" w:w="100"/>
+              <w:right w:type="dxa" w:w="120"/>
+            </w:tcMar>
+          </w:tcPr>
+          <w:p>
+            <w:pPr>
+              <w:jc w:val="center"/>
+            </w:pPr>
+            <w:r>
+              <w:rPr>
+                <w:rFonts w:ascii="Calibri" w:cs="Calibri" w:eastAsia="Calibri" w:hAnsi="Calibri"/>
+                <w:b/>
+                <w:bCs/>
+                <w:color w:val="0066CC"/>
+                <w:sz w:val="16"/>
+                <w:szCs w:val="16"/>
+              </w:rPr>
+              <w:t xml:space="preserve">LIC_MLT</w:t>
+            </w:r>
+          </w:p>
+        </w:tc>
+        <w:tc>
+          <w:tcPr>
+            <w:tcW w:type="dxa" w:w="2800"/>
+            <w:shd w:fill="FFFFFF" w:val="clear"/>
+            <w:tcMar>
+              <w:top w:type="dxa" w:w="100"/>
+              <w:left w:type="dxa" w:w="120"/>
+              <w:bottom w:type="dxa" w:w="100"/>
+              <w:right w:type="dxa" w:w="120"/>
+            </w:tcMar>
+          </w:tcPr>
+          <w:p>
+            <w:r>
+              <w:rPr>
+                <w:rFonts w:ascii="Calibri" w:cs="Calibri" w:eastAsia="Calibri" w:hAnsi="Calibri"/>
+                <w:b/>
+                <w:bCs/>
+                <w:color w:val="0F172A"/>
+                <w:sz w:val="16"/>
+                <w:szCs w:val="16"/>
+              </w:rPr>
+              <w:t xml:space="preserve">Median Lead Time (MLT) Pemrosesan Izin</w:t>
+            </w:r>
+          </w:p>
+        </w:tc>
+        <w:tc>
+          <w:tcPr>
+            <w:tcW w:type="dxa" w:w="1600"/>
+            <w:shd w:fill="FFFFFF" w:val="clear"/>
+            <w:tcMar>
+              <w:top w:type="dxa" w:w="100"/>
+              <w:left w:type="dxa" w:w="120"/>
+              <w:bottom w:type="dxa" w:w="100"/>
+              <w:right w:type="dxa" w:w="120"/>
+            </w:tcMar>
+          </w:tcPr>
+          <w:p>
+            <w:pPr>
+              <w:jc w:val="center"/>
+            </w:pPr>
+            <w:r>
+              <w:rPr>
+                <w:rFonts w:ascii="Calibri" w:cs="Calibri" w:eastAsia="Calibri" w:hAnsi="Calibri"/>
+                <w:b/>
+                <w:bCs/>
+                <w:color w:val="64748B"/>
+                <w:sz w:val="16"/>
+                <w:szCs w:val="16"/>
+              </w:rPr>
+              <w:t xml:space="preserve">Operational Driver</w:t>
+            </w:r>
+          </w:p>
+        </w:tc>
+        <w:tc>
+          <w:tcPr>
+            <w:tcW w:type="dxa" w:w="3600"/>
+            <w:shd w:fill="FFFFFF" w:val="clear"/>
+            <w:tcMar>
+              <w:top w:type="dxa" w:w="100"/>
+              <w:left w:type="dxa" w:w="120"/>
+              <w:bottom w:type="dxa" w:w="100"/>
+              <w:right w:type="dxa" w:w="120"/>
+            </w:tcMar>
+          </w:tcPr>
+          <w:p>
+            <w:r>
+              <w:rPr>
+                <w:rFonts w:ascii="Calibri" w:cs="Calibri" w:eastAsia="Calibri" w:hAnsi="Calibri"/>
+                <w:color w:val="334155"/>
+                <w:sz w:val="16"/>
+                <w:szCs w:val="16"/>
+              </w:rPr>
+              <w:t xml:space="preserve">Nilai tengah hari kerja yang dihabiskan sejak berkas diunggah hingga dokumen perizinan resmi diterbitkan.</w:t>
+            </w:r>
+          </w:p>
+        </w:tc>
+        <w:tc>
+          <w:tcPr>
+            <w:tcW w:type="dxa" w:w="3800"/>
+            <w:shd w:fill="FFFFFF" w:val="clear"/>
+            <w:tcMar>
+              <w:top w:type="dxa" w:w="100"/>
+              <w:left w:type="dxa" w:w="120"/>
+              <w:bottom w:type="dxa" w:w="100"/>
+              <w:right w:type="dxa" w:w="120"/>
+            </w:tcMar>
+          </w:tcPr>
+          <w:p>
+            <w:r>
+              <w:rPr>
+                <w:rFonts w:ascii="Calibri" w:cs="Calibri" w:eastAsia="Calibri" w:hAnsi="Calibri"/>
+                <w:b/>
+                <w:bCs/>
+                <w:color w:val="0F172A"/>
+                <w:sz w:val="16"/>
+                <w:szCs w:val="16"/>
+              </w:rPr>
+              <w:t xml:space="preserve">MEDIAN(DATEDIFF("day", [Tgl Permohonan], [Tgl Terbit Izin]))</w:t>
+            </w:r>
+          </w:p>
+        </w:tc>
+      </w:tr>
+      <w:tr>
+        <w:trPr>
+          <w:cantSplit/>
+        </w:trPr>
+        <w:tc>
+          <w:tcPr>
+            <w:tcW w:type="dxa" w:w="1800"/>
+            <w:shd w:fill="F8FAFC" w:val="clear"/>
+            <w:tcMar>
+              <w:top w:type="dxa" w:w="100"/>
+              <w:left w:type="dxa" w:w="120"/>
+              <w:bottom w:type="dxa" w:w="100"/>
+              <w:right w:type="dxa" w:w="120"/>
+            </w:tcMar>
+          </w:tcPr>
+          <w:p>
+            <w:r>
+              <w:rPr>
+                <w:rFonts w:ascii="Calibri" w:cs="Calibri" w:eastAsia="Calibri" w:hAnsi="Calibri"/>
+                <w:b/>
+                <w:bCs/>
+                <w:color w:val="0F172A"/>
+                <w:sz w:val="16"/>
+                <w:szCs w:val="16"/>
+              </w:rPr>
+              <w:t xml:space="preserve">PTSP / Manajemen Risiko</w:t>
+            </w:r>
+          </w:p>
+        </w:tc>
+        <w:tc>
+          <w:tcPr>
+            <w:tcW w:type="dxa" w:w="1800"/>
+            <w:shd w:fill="F8FAFC" w:val="clear"/>
+            <w:tcMar>
+              <w:top w:type="dxa" w:w="100"/>
+              <w:left w:type="dxa" w:w="120"/>
+              <w:bottom w:type="dxa" w:w="100"/>
+              <w:right w:type="dxa" w:w="120"/>
+            </w:tcMar>
+          </w:tcPr>
+          <w:p>
+            <w:pPr>
+              <w:jc w:val="center"/>
+            </w:pPr>
+            <w:r>
+              <w:rPr>
+                <w:rFonts w:ascii="Calibri" w:cs="Calibri" w:eastAsia="Calibri" w:hAnsi="Calibri"/>
+                <w:b/>
+                <w:bCs/>
+                <w:color w:val="0066CC"/>
+                <w:sz w:val="16"/>
+                <w:szCs w:val="16"/>
+              </w:rPr>
+              <w:t xml:space="preserve">LIC_BOTTLENECK</w:t>
+            </w:r>
+          </w:p>
+        </w:tc>
+        <w:tc>
+          <w:tcPr>
+            <w:tcW w:type="dxa" w:w="2800"/>
+            <w:shd w:fill="F8FAFC" w:val="clear"/>
+            <w:tcMar>
+              <w:top w:type="dxa" w:w="100"/>
+              <w:left w:type="dxa" w:w="120"/>
+              <w:bottom w:type="dxa" w:w="100"/>
+              <w:right w:type="dxa" w:w="120"/>
+            </w:tcMar>
+          </w:tcPr>
+          <w:p>
+            <w:r>
+              <w:rPr>
+                <w:rFonts w:ascii="Calibri" w:cs="Calibri" w:eastAsia="Calibri" w:hAnsi="Calibri"/>
+                <w:b/>
+                <w:bCs/>
+                <w:color w:val="0F172A"/>
+                <w:sz w:val="16"/>
+                <w:szCs w:val="16"/>
+              </w:rPr>
+              <w:t xml:space="preserve">Tingkat Keterlambatan Layanan (Bottleneck Rate)</w:t>
+            </w:r>
+          </w:p>
+        </w:tc>
+        <w:tc>
+          <w:tcPr>
+            <w:tcW w:type="dxa" w:w="1600"/>
+            <w:shd w:fill="F8FAFC" w:val="clear"/>
+            <w:tcMar>
+              <w:top w:type="dxa" w:w="100"/>
+              <w:left w:type="dxa" w:w="120"/>
+              <w:bottom w:type="dxa" w:w="100"/>
+              <w:right w:type="dxa" w:w="120"/>
+            </w:tcMar>
+          </w:tcPr>
+          <w:p>
+            <w:pPr>
+              <w:jc w:val="center"/>
+            </w:pPr>
+            <w:r>
+              <w:rPr>
+                <w:rFonts w:ascii="Calibri" w:cs="Calibri" w:eastAsia="Calibri" w:hAnsi="Calibri"/>
+                <w:b/>
+                <w:bCs/>
+                <w:color w:val="64748B"/>
+                <w:sz w:val="16"/>
+                <w:szCs w:val="16"/>
+              </w:rPr>
+              <w:t xml:space="preserve">Operational Driver</w:t>
+            </w:r>
+          </w:p>
+        </w:tc>
+        <w:tc>
+          <w:tcPr>
+            <w:tcW w:type="dxa" w:w="3600"/>
+            <w:shd w:fill="F8FAFC" w:val="clear"/>
+            <w:tcMar>
+              <w:top w:type="dxa" w:w="100"/>
+              <w:left w:type="dxa" w:w="120"/>
+              <w:bottom w:type="dxa" w:w="100"/>
+              <w:right w:type="dxa" w:w="120"/>
+            </w:tcMar>
+          </w:tcPr>
+          <w:p>
+            <w:r>
+              <w:rPr>
+                <w:rFonts w:ascii="Calibri" w:cs="Calibri" w:eastAsia="Calibri" w:hAnsi="Calibri"/>
+                <w:color w:val="334155"/>
+                <w:sz w:val="16"/>
+                <w:szCs w:val="16"/>
+              </w:rPr>
+              <w:t xml:space="preserve">Persentase permohonan yang mengalami keterlambatan melebihi batas waktu SLA yang memerlukan eskalasi.</w:t>
+            </w:r>
+          </w:p>
+        </w:tc>
+        <w:tc>
+          <w:tcPr>
+            <w:tcW w:type="dxa" w:w="3800"/>
+            <w:shd w:fill="F8FAFC" w:val="clear"/>
+            <w:tcMar>
+              <w:top w:type="dxa" w:w="100"/>
+              <w:left w:type="dxa" w:w="120"/>
+              <w:bottom w:type="dxa" w:w="100"/>
+              <w:right w:type="dxa" w:w="120"/>
+            </w:tcMar>
+          </w:tcPr>
+          <w:p>
+            <w:r>
+              <w:rPr>
+                <w:rFonts w:ascii="Calibri" w:cs="Calibri" w:eastAsia="Calibri" w:hAnsi="Calibri"/>
+                <w:b/>
+                <w:bCs/>
+                <w:color w:val="0F172A"/>
+                <w:sz w:val="16"/>
+                <w:szCs w:val="16"/>
+              </w:rPr>
+              <w:t xml:space="preserve">SUM(IIF([Durasi Hari] &gt; [Target SLA], 1, 0)) ÷ Total Permohonan × 100%</w:t>
+            </w:r>
+          </w:p>
+        </w:tc>
+      </w:tr>
+      <w:tr>
+        <w:trPr>
+          <w:cantSplit/>
+        </w:trPr>
+        <w:tc>
+          <w:tcPr>
+            <w:tcW w:type="dxa" w:w="1800"/>
+            <w:shd w:fill="FFFFFF" w:val="clear"/>
+            <w:tcMar>
+              <w:top w:type="dxa" w:w="100"/>
+              <w:left w:type="dxa" w:w="120"/>
+              <w:bottom w:type="dxa" w:w="100"/>
+              <w:right w:type="dxa" w:w="120"/>
+            </w:tcMar>
+          </w:tcPr>
+          <w:p>
+            <w:r>
+              <w:rPr>
+                <w:rFonts w:ascii="Calibri" w:cs="Calibri" w:eastAsia="Calibri" w:hAnsi="Calibri"/>
+                <w:b/>
+                <w:bCs/>
+                <w:color w:val="0F172A"/>
+                <w:sz w:val="16"/>
+                <w:szCs w:val="16"/>
+              </w:rPr>
+              <w:t xml:space="preserve">PTSP / Penanganan Pengaduan</w:t>
+            </w:r>
+          </w:p>
+        </w:tc>
+        <w:tc>
+          <w:tcPr>
+            <w:tcW w:type="dxa" w:w="1800"/>
+            <w:shd w:fill="FFFFFF" w:val="clear"/>
+            <w:tcMar>
+              <w:top w:type="dxa" w:w="100"/>
+              <w:left w:type="dxa" w:w="120"/>
+              <w:bottom w:type="dxa" w:w="100"/>
+              <w:right w:type="dxa" w:w="120"/>
+            </w:tcMar>
+          </w:tcPr>
+          <w:p>
+            <w:pPr>
+              <w:jc w:val="center"/>
+            </w:pPr>
+            <w:r>
+              <w:rPr>
+                <w:rFonts w:ascii="Calibri" w:cs="Calibri" w:eastAsia="Calibri" w:hAnsi="Calibri"/>
+                <w:b/>
+                <w:bCs/>
+                <w:color w:val="0066CC"/>
+                <w:sz w:val="16"/>
+                <w:szCs w:val="16"/>
+              </w:rPr>
+              <w:t xml:space="preserve">SAT_CCR</w:t>
+            </w:r>
+          </w:p>
+        </w:tc>
+        <w:tc>
+          <w:tcPr>
+            <w:tcW w:type="dxa" w:w="2800"/>
+            <w:shd w:fill="FFFFFF" w:val="clear"/>
+            <w:tcMar>
+              <w:top w:type="dxa" w:w="100"/>
+              <w:left w:type="dxa" w:w="120"/>
+              <w:bottom w:type="dxa" w:w="100"/>
+              <w:right w:type="dxa" w:w="120"/>
+            </w:tcMar>
+          </w:tcPr>
+          <w:p>
+            <w:r>
+              <w:rPr>
+                <w:rFonts w:ascii="Calibri" w:cs="Calibri" w:eastAsia="Calibri" w:hAnsi="Calibri"/>
+                <w:b/>
+                <w:bCs/>
+                <w:color w:val="0F172A"/>
+                <w:sz w:val="16"/>
+                <w:szCs w:val="16"/>
+              </w:rPr>
+              <w:t xml:space="preserve">Complaint Close Rate (CCR) SP4N-LAPOR! &amp; MPP</w:t>
+            </w:r>
+          </w:p>
+        </w:tc>
+        <w:tc>
+          <w:tcPr>
+            <w:tcW w:type="dxa" w:w="1600"/>
+            <w:shd w:fill="FFFFFF" w:val="clear"/>
+            <w:tcMar>
+              <w:top w:type="dxa" w:w="100"/>
+              <w:left w:type="dxa" w:w="120"/>
+              <w:bottom w:type="dxa" w:w="100"/>
+              <w:right w:type="dxa" w:w="120"/>
+            </w:tcMar>
+          </w:tcPr>
+          <w:p>
+            <w:pPr>
+              <w:jc w:val="center"/>
+            </w:pPr>
+            <w:r>
+              <w:rPr>
+                <w:rFonts w:ascii="Calibri" w:cs="Calibri" w:eastAsia="Calibri" w:hAnsi="Calibri"/>
+                <w:b/>
+                <w:bCs/>
+                <w:color w:val="15803D"/>
+                <w:sz w:val="16"/>
+                <w:szCs w:val="16"/>
+              </w:rPr>
+              <w:t xml:space="preserve">Executive</w:t>
+            </w:r>
+          </w:p>
+        </w:tc>
+        <w:tc>
+          <w:tcPr>
+            <w:tcW w:type="dxa" w:w="3600"/>
+            <w:shd w:fill="FFFFFF" w:val="clear"/>
+            <w:tcMar>
+              <w:top w:type="dxa" w:w="100"/>
+              <w:left w:type="dxa" w:w="120"/>
+              <w:bottom w:type="dxa" w:w="100"/>
+              <w:right w:type="dxa" w:w="120"/>
+            </w:tcMar>
+          </w:tcPr>
+          <w:p>
+            <w:r>
+              <w:rPr>
+                <w:rFonts w:ascii="Calibri" w:cs="Calibri" w:eastAsia="Calibri" w:hAnsi="Calibri"/>
+                <w:color w:val="334155"/>
+                <w:sz w:val="16"/>
+                <w:szCs w:val="16"/>
+              </w:rPr>
+              <w:t xml:space="preserve">Rasio penyelesaian pengaduan masyarakat yang berhasil diselesaikan solusinya terhadap seluruh keluhan yang masuk.</w:t>
+            </w:r>
+          </w:p>
+        </w:tc>
+        <w:tc>
+          <w:tcPr>
+            <w:tcW w:type="dxa" w:w="3800"/>
+            <w:shd w:fill="FFFFFF" w:val="clear"/>
+            <w:tcMar>
+              <w:top w:type="dxa" w:w="100"/>
+              <w:left w:type="dxa" w:w="120"/>
+              <w:bottom w:type="dxa" w:w="100"/>
+              <w:right w:type="dxa" w:w="120"/>
+            </w:tcMar>
+          </w:tcPr>
+          <w:p>
+            <w:r>
+              <w:rPr>
+                <w:rFonts w:ascii="Calibri" w:cs="Calibri" w:eastAsia="Calibri" w:hAnsi="Calibri"/>
+                <w:b/>
+                <w:bCs/>
+                <w:color w:val="0F172A"/>
+                <w:sz w:val="16"/>
+                <w:szCs w:val="16"/>
+              </w:rPr>
+              <w:t xml:space="preserve">Jumlah Pengaduan Selesai ÷ Total Pengaduan Masuk × 100%</w:t>
+            </w:r>
+          </w:p>
+        </w:tc>
+      </w:tr>
+      <w:tr>
+        <w:trPr>
+          <w:cantSplit/>
+        </w:trPr>
+        <w:tc>
+          <w:tcPr>
+            <w:tcW w:type="dxa" w:w="1800"/>
+            <w:shd w:fill="F8FAFC" w:val="clear"/>
+            <w:tcMar>
+              <w:top w:type="dxa" w:w="100"/>
+              <w:left w:type="dxa" w:w="120"/>
+              <w:bottom w:type="dxa" w:w="100"/>
+              <w:right w:type="dxa" w:w="120"/>
+            </w:tcMar>
+          </w:tcPr>
+          <w:p>
+            <w:r>
+              <w:rPr>
+                <w:rFonts w:ascii="Calibri" w:cs="Calibri" w:eastAsia="Calibri" w:hAnsi="Calibri"/>
+                <w:b/>
+                <w:bCs/>
+                <w:color w:val="0F172A"/>
+                <w:sz w:val="16"/>
+                <w:szCs w:val="16"/>
+              </w:rPr>
+              <w:t xml:space="preserve">PTSP / Maritim &amp; Logistik</w:t>
+            </w:r>
+          </w:p>
+        </w:tc>
+        <w:tc>
+          <w:tcPr>
+            <w:tcW w:type="dxa" w:w="1800"/>
+            <w:shd w:fill="F8FAFC" w:val="clear"/>
+            <w:tcMar>
+              <w:top w:type="dxa" w:w="100"/>
+              <w:left w:type="dxa" w:w="120"/>
+              <w:bottom w:type="dxa" w:w="100"/>
+              <w:right w:type="dxa" w:w="120"/>
+            </w:tcMar>
+          </w:tcPr>
+          <w:p>
+            <w:pPr>
+              <w:jc w:val="center"/>
+            </w:pPr>
+            <w:r>
+              <w:rPr>
+                <w:rFonts w:ascii="Calibri" w:cs="Calibri" w:eastAsia="Calibri" w:hAnsi="Calibri"/>
+                <w:b/>
+                <w:bCs/>
+                <w:color w:val="0066CC"/>
+                <w:sz w:val="16"/>
+                <w:szCs w:val="16"/>
+              </w:rPr>
+              <w:t xml:space="preserve">MAR_SKKBM</w:t>
+            </w:r>
+          </w:p>
+        </w:tc>
+        <w:tc>
+          <w:tcPr>
+            <w:tcW w:type="dxa" w:w="2800"/>
+            <w:shd w:fill="F8FAFC" w:val="clear"/>
+            <w:tcMar>
+              <w:top w:type="dxa" w:w="100"/>
+              <w:left w:type="dxa" w:w="120"/>
+              <w:bottom w:type="dxa" w:w="100"/>
+              <w:right w:type="dxa" w:w="120"/>
+            </w:tcMar>
+          </w:tcPr>
+          <w:p>
+            <w:r>
+              <w:rPr>
+                <w:rFonts w:ascii="Calibri" w:cs="Calibri" w:eastAsia="Calibri" w:hAnsi="Calibri"/>
+                <w:b/>
+                <w:bCs/>
+                <w:color w:val="0F172A"/>
+                <w:sz w:val="16"/>
+                <w:szCs w:val="16"/>
+              </w:rPr>
+              <w:t xml:space="preserve">Volume Izin Bongkar Muat (SKKBM)</w:t>
+            </w:r>
+          </w:p>
+        </w:tc>
+        <w:tc>
+          <w:tcPr>
+            <w:tcW w:type="dxa" w:w="1600"/>
+            <w:shd w:fill="F8FAFC" w:val="clear"/>
+            <w:tcMar>
+              <w:top w:type="dxa" w:w="100"/>
+              <w:left w:type="dxa" w:w="120"/>
+              <w:bottom w:type="dxa" w:w="100"/>
+              <w:right w:type="dxa" w:w="120"/>
+            </w:tcMar>
+          </w:tcPr>
+          <w:p>
+            <w:pPr>
+              <w:jc w:val="center"/>
+            </w:pPr>
+            <w:r>
+              <w:rPr>
+                <w:rFonts w:ascii="Calibri" w:cs="Calibri" w:eastAsia="Calibri" w:hAnsi="Calibri"/>
+                <w:b/>
+                <w:bCs/>
+                <w:color w:val="B45309"/>
+                <w:sz w:val="16"/>
+                <w:szCs w:val="16"/>
+              </w:rPr>
+              <w:t xml:space="preserve">Program Driver</w:t>
+            </w:r>
+          </w:p>
+        </w:tc>
+        <w:tc>
+          <w:tcPr>
+            <w:tcW w:type="dxa" w:w="3600"/>
+            <w:shd w:fill="F8FAFC" w:val="clear"/>
+            <w:tcMar>
+              <w:top w:type="dxa" w:w="100"/>
+              <w:left w:type="dxa" w:w="120"/>
+              <w:bottom w:type="dxa" w:w="100"/>
+              <w:right w:type="dxa" w:w="120"/>
+            </w:tcMar>
+          </w:tcPr>
+          <w:p>
+            <w:r>
+              <w:rPr>
+                <w:rFonts w:ascii="Calibri" w:cs="Calibri" w:eastAsia="Calibri" w:hAnsi="Calibri"/>
+                <w:color w:val="334155"/>
+                <w:sz w:val="16"/>
+                <w:szCs w:val="16"/>
+              </w:rPr>
+              <w:t xml:space="preserve">Jumlah surat keterangan kerja bongkar muat barang yang diterbitkan untuk aktivitas pelabuhan di Batam.</w:t>
+            </w:r>
+          </w:p>
+        </w:tc>
+        <w:tc>
+          <w:tcPr>
+            <w:tcW w:type="dxa" w:w="3800"/>
+            <w:shd w:fill="F8FAFC" w:val="clear"/>
+            <w:tcMar>
+              <w:top w:type="dxa" w:w="100"/>
+              <w:left w:type="dxa" w:w="120"/>
+              <w:bottom w:type="dxa" w:w="100"/>
+              <w:right w:type="dxa" w:w="120"/>
+            </w:tcMar>
+          </w:tcPr>
+          <w:p>
+            <w:r>
+              <w:rPr>
+                <w:rFonts w:ascii="Calibri" w:cs="Calibri" w:eastAsia="Calibri" w:hAnsi="Calibri"/>
+                <w:b/>
+                <w:bCs/>
+                <w:color w:val="0F172A"/>
+                <w:sz w:val="16"/>
+                <w:szCs w:val="16"/>
+              </w:rPr>
+              <w:t xml:space="preserve">COUNT([Nomor SKKBM Terbit]) per Periode</w:t>
+            </w:r>
+          </w:p>
+        </w:tc>
+      </w:tr>
+      <w:tr>
+        <w:trPr>
+          <w:cantSplit/>
+        </w:trPr>
+        <w:tc>
+          <w:tcPr>
+            <w:tcW w:type="dxa" w:w="1800"/>
+            <w:shd w:fill="FFFFFF" w:val="clear"/>
+            <w:tcMar>
+              <w:top w:type="dxa" w:w="100"/>
+              <w:left w:type="dxa" w:w="120"/>
+              <w:bottom w:type="dxa" w:w="100"/>
+              <w:right w:type="dxa" w:w="120"/>
+            </w:tcMar>
+          </w:tcPr>
+          <w:p>
+            <w:r>
+              <w:rPr>
+                <w:rFonts w:ascii="Calibri" w:cs="Calibri" w:eastAsia="Calibri" w:hAnsi="Calibri"/>
+                <w:b/>
+                <w:bCs/>
+                <w:color w:val="0F172A"/>
+                <w:sz w:val="16"/>
+                <w:szCs w:val="16"/>
+              </w:rPr>
+              <w:t xml:space="preserve">PTSP / Maritim &amp; Logistik</w:t>
+            </w:r>
+          </w:p>
+        </w:tc>
+        <w:tc>
+          <w:tcPr>
+            <w:tcW w:type="dxa" w:w="1800"/>
+            <w:shd w:fill="FFFFFF" w:val="clear"/>
+            <w:tcMar>
+              <w:top w:type="dxa" w:w="100"/>
+              <w:left w:type="dxa" w:w="120"/>
+              <w:bottom w:type="dxa" w:w="100"/>
+              <w:right w:type="dxa" w:w="120"/>
+            </w:tcMar>
+          </w:tcPr>
+          <w:p>
+            <w:pPr>
+              <w:jc w:val="center"/>
+            </w:pPr>
+            <w:r>
+              <w:rPr>
+                <w:rFonts w:ascii="Calibri" w:cs="Calibri" w:eastAsia="Calibri" w:hAnsi="Calibri"/>
+                <w:b/>
+                <w:bCs/>
+                <w:color w:val="0066CC"/>
+                <w:sz w:val="16"/>
+                <w:szCs w:val="16"/>
+              </w:rPr>
+              <w:t xml:space="preserve">MAR_SPJK</w:t>
+            </w:r>
+          </w:p>
+        </w:tc>
+        <w:tc>
+          <w:tcPr>
+            <w:tcW w:type="dxa" w:w="2800"/>
+            <w:shd w:fill="FFFFFF" w:val="clear"/>
+            <w:tcMar>
+              <w:top w:type="dxa" w:w="100"/>
+              <w:left w:type="dxa" w:w="120"/>
+              <w:bottom w:type="dxa" w:w="100"/>
+              <w:right w:type="dxa" w:w="120"/>
+            </w:tcMar>
+          </w:tcPr>
+          <w:p>
+            <w:r>
+              <w:rPr>
+                <w:rFonts w:ascii="Calibri" w:cs="Calibri" w:eastAsia="Calibri" w:hAnsi="Calibri"/>
+                <w:b/>
+                <w:bCs/>
+                <w:color w:val="0F172A"/>
+                <w:sz w:val="16"/>
+                <w:szCs w:val="16"/>
+              </w:rPr>
+              <w:t xml:space="preserve">Persetujuan Jadwal Kedatangan Kapal (SPJK)</w:t>
+            </w:r>
+          </w:p>
+        </w:tc>
+        <w:tc>
+          <w:tcPr>
+            <w:tcW w:type="dxa" w:w="1600"/>
+            <w:shd w:fill="FFFFFF" w:val="clear"/>
+            <w:tcMar>
+              <w:top w:type="dxa" w:w="100"/>
+              <w:left w:type="dxa" w:w="120"/>
+              <w:bottom w:type="dxa" w:w="100"/>
+              <w:right w:type="dxa" w:w="120"/>
+            </w:tcMar>
+          </w:tcPr>
+          <w:p>
+            <w:pPr>
+              <w:jc w:val="center"/>
+            </w:pPr>
+            <w:r>
+              <w:rPr>
+                <w:rFonts w:ascii="Calibri" w:cs="Calibri" w:eastAsia="Calibri" w:hAnsi="Calibri"/>
+                <w:b/>
+                <w:bCs/>
+                <w:color w:val="64748B"/>
+                <w:sz w:val="16"/>
+                <w:szCs w:val="16"/>
+              </w:rPr>
+              <w:t xml:space="preserve">Operational Driver</w:t>
+            </w:r>
+          </w:p>
+        </w:tc>
+        <w:tc>
+          <w:tcPr>
+            <w:tcW w:type="dxa" w:w="3600"/>
+            <w:shd w:fill="FFFFFF" w:val="clear"/>
+            <w:tcMar>
+              <w:top w:type="dxa" w:w="100"/>
+              <w:left w:type="dxa" w:w="120"/>
+              <w:bottom w:type="dxa" w:w="100"/>
+              <w:right w:type="dxa" w:w="120"/>
+            </w:tcMar>
+          </w:tcPr>
+          <w:p>
+            <w:r>
+              <w:rPr>
+                <w:rFonts w:ascii="Calibri" w:cs="Calibri" w:eastAsia="Calibri" w:hAnsi="Calibri"/>
+                <w:color w:val="334155"/>
+                <w:sz w:val="16"/>
+                <w:szCs w:val="16"/>
+              </w:rPr>
+              <w:t xml:space="preserve">Jumlah verifikasi dan persetujuan jadwal operasional kapal kargo dan penumpang di pelabuhan BP Batam.</w:t>
+            </w:r>
+          </w:p>
+        </w:tc>
+        <w:tc>
+          <w:tcPr>
+            <w:tcW w:type="dxa" w:w="3800"/>
+            <w:shd w:fill="FFFFFF" w:val="clear"/>
+            <w:tcMar>
+              <w:top w:type="dxa" w:w="100"/>
+              <w:left w:type="dxa" w:w="120"/>
+              <w:bottom w:type="dxa" w:w="100"/>
+              <w:right w:type="dxa" w:w="120"/>
+            </w:tcMar>
+          </w:tcPr>
+          <w:p>
+            <w:r>
+              <w:rPr>
+                <w:rFonts w:ascii="Calibri" w:cs="Calibri" w:eastAsia="Calibri" w:hAnsi="Calibri"/>
+                <w:b/>
+                <w:bCs/>
+                <w:color w:val="0F172A"/>
+                <w:sz w:val="16"/>
+                <w:szCs w:val="16"/>
+              </w:rPr>
+              <w:t xml:space="preserve">COUNT([Nomor SPJK Terbit]) per Periode</w:t>
             </w:r>
           </w:p>
         </w:tc>

</xml_diff>

<commit_message>
refactor: update KPI dashboard structure and defaults
Reorganize KPI display to prioritize consolidated IKM metrics, remove outdated UI elements, and set default sub-tabs to primary data views for a cleaner, more focused user experience.
</commit_message>
<xml_diff>
--- a/public/Kamus_KPI_Dashboard_Biro_Keuangan_dan_PDSI_BP_Batam.docx
+++ b/public/Kamus_KPI_Dashboard_Biro_Keuangan_dan_PDSI_BP_Batam.docx
@@ -81,12 +81,12 @@
         </w:tblBorders>
       </w:tblPr>
       <w:tblGrid>
-        <w:gridCol w:w="100"/>
-        <w:gridCol w:w="100"/>
-        <w:gridCol w:w="100"/>
-        <w:gridCol w:w="100"/>
-        <w:gridCol w:w="100"/>
-        <w:gridCol w:w="100"/>
+        <w:gridCol w:w="1800"/>
+        <w:gridCol w:w="1800"/>
+        <w:gridCol w:w="2800"/>
+        <w:gridCol w:w="1600"/>
+        <w:gridCol w:w="3600"/>
+        <w:gridCol w:w="3800"/>
       </w:tblGrid>
       <w:tr>
         <w:trPr>
@@ -6865,10 +6865,6 @@
 </w:document>
 </file>
 
-<file path=word/comments.xml><?xml version="1.0" encoding="utf-8"?>
-<w:comments xmlns:cx="http://schemas.microsoft.com/office/drawing/2014/chartex" xmlns:cx1="http://schemas.microsoft.com/office/drawing/2015/9/8/chartex" xmlns:cx2="http://schemas.microsoft.com/office/drawing/2015/10/21/chartex" xmlns:cx3="http://schemas.microsoft.com/office/drawing/2016/5/9/chartex" xmlns:cx4="http://schemas.microsoft.com/office/drawing/2016/5/10/chartex" xmlns:cx5="http://schemas.microsoft.com/office/drawing/2016/5/11/chartex" xmlns:cx6="http://schemas.microsoft.com/office/drawing/2016/5/12/chartex" xmlns:cx7="http://schemas.microsoft.com/office/drawing/2016/5/13/chartex" xmlns:cx8="http://schemas.microsoft.com/office/drawing/2016/5/14/chartex" xmlns:mc="http://schemas.openxmlformats.org/markup-compatibility/2006" xmlns:aink="http://schemas.microsoft.com/office/drawing/2016/ink" xmlns:am3d="http://schemas.microsoft.com/office/drawing/2017/model3d" xmlns:o="urn:schemas-microsoft-com:office:office" xmlns:r="http://schemas.openxmlformats.org/officeDocument/2006/relationships" xmlns:m="http://schemas.openxmlformats.org/officeDocument/2006/math" xmlns:v="urn:schemas-microsoft-com:vml" xmlns:wp14="http://schemas.microsoft.com/office/word/2010/wordprocessingDrawing" xmlns:wp="http://schemas.openxmlformats.org/drawingml/2006/wordprocessingDrawing" xmlns:w10="urn:schemas-microsoft-com:office:word" xmlns:w="http://schemas.openxmlformats.org/wordprocessingml/2006/main" xmlns:w14="http://schemas.microsoft.com/office/word/2010/wordml" xmlns:w15="http://schemas.microsoft.com/office/word/2012/wordml" xmlns:w16cex="http://schemas.microsoft.com/office/word/2018/wordml/cex" xmlns:w16cid="http://schemas.microsoft.com/office/word/2016/wordml/cid" xmlns:w16="http://schemas.microsoft.com/office/word/2018/wordml" xmlns:w16sdtdh="http://schemas.microsoft.com/office/word/2020/wordml/sdtdatahash" xmlns:w16se="http://schemas.microsoft.com/office/word/2015/wordml/symex" xmlns:wpg="http://schemas.microsoft.com/office/word/2010/wordprocessingGroup" xmlns:wpi="http://schemas.microsoft.com/office/word/2010/wordprocessingInk" xmlns:wne="http://schemas.microsoft.com/office/word/2006/wordml" xmlns:wps="http://schemas.microsoft.com/office/word/2010/wordprocessingShape"/>
-</file>
-
 <file path=word/endnotes.xml><?xml version="1.0" encoding="utf-8"?>
 <w:endnotes xmlns:wpc="http://schemas.microsoft.com/office/word/2010/wordprocessingCanvas" xmlns:mc="http://schemas.openxmlformats.org/markup-compatibility/2006" xmlns:o="urn:schemas-microsoft-com:office:office" xmlns:r="http://schemas.openxmlformats.org/officeDocument/2006/relationships" xmlns:m="http://schemas.openxmlformats.org/officeDocument/2006/math" xmlns:v="urn:schemas-microsoft-com:vml" xmlns:wp14="http://schemas.microsoft.com/office/word/2010/wordprocessingDrawing" xmlns:wp="http://schemas.openxmlformats.org/drawingml/2006/wordprocessingDrawing" xmlns:w10="urn:schemas-microsoft-com:office:word" xmlns:w="http://schemas.openxmlformats.org/wordprocessingml/2006/main" xmlns:w14="http://schemas.microsoft.com/office/word/2010/wordml" xmlns:w15="http://schemas.microsoft.com/office/word/2012/wordml" xmlns:wpg="http://schemas.microsoft.com/office/word/2010/wordprocessingGroup" xmlns:wpi="http://schemas.microsoft.com/office/word/2010/wordprocessingInk" xmlns:wne="http://schemas.microsoft.com/office/word/2006/wordml" xmlns:wps="http://schemas.microsoft.com/office/word/2010/wordprocessingShape" mc:Ignorable="w14 w15 wp14">
   <w:endnote w:type="separator" w:id="-1">
@@ -6947,7 +6943,7 @@
 <w:numbering xmlns:wpc="http://schemas.microsoft.com/office/word/2010/wordprocessingCanvas" xmlns:mc="http://schemas.openxmlformats.org/markup-compatibility/2006" xmlns:o="urn:schemas-microsoft-com:office:office" xmlns:r="http://schemas.openxmlformats.org/officeDocument/2006/relationships" xmlns:m="http://schemas.openxmlformats.org/officeDocument/2006/math" xmlns:v="urn:schemas-microsoft-com:vml" xmlns:wp14="http://schemas.microsoft.com/office/word/2010/wordprocessingDrawing" xmlns:wp="http://schemas.openxmlformats.org/drawingml/2006/wordprocessingDrawing" xmlns:w10="urn:schemas-microsoft-com:office:word" xmlns:w="http://schemas.openxmlformats.org/wordprocessingml/2006/main" xmlns:w14="http://schemas.microsoft.com/office/word/2010/wordml" xmlns:w15="http://schemas.microsoft.com/office/word/2012/wordml" xmlns:wpg="http://schemas.microsoft.com/office/word/2010/wordprocessingGroup" xmlns:wpi="http://schemas.microsoft.com/office/word/2010/wordprocessingInk" xmlns:wne="http://schemas.microsoft.com/office/word/2006/wordml" xmlns:wps="http://schemas.microsoft.com/office/word/2010/wordprocessingShape" mc:Ignorable="w14 w15 wp14">
   <w:abstractNum w:abstractNumId="1" w15:restartNumberingAfterBreak="0">
     <w:multiLevelType w:val="hybridMultilevel"/>
-    <w:lvl w:ilvl="0" w15:tentative="1">
+    <w:lvl w:ilvl="0" w:tentative="1">
       <w:start w:val="1"/>
       <w:numFmt w:val="bullet"/>
       <w:lvlText w:val="●"/>
@@ -6956,7 +6952,7 @@
         <w:ind w:left="720" w:hanging="360"/>
       </w:pPr>
     </w:lvl>
-    <w:lvl w:ilvl="1" w15:tentative="1">
+    <w:lvl w:ilvl="1" w:tentative="1">
       <w:start w:val="1"/>
       <w:numFmt w:val="bullet"/>
       <w:lvlText w:val="○"/>
@@ -6965,7 +6961,7 @@
         <w:ind w:left="1440" w:hanging="360"/>
       </w:pPr>
     </w:lvl>
-    <w:lvl w:ilvl="2" w15:tentative="1">
+    <w:lvl w:ilvl="2" w:tentative="1">
       <w:start w:val="1"/>
       <w:numFmt w:val="bullet"/>
       <w:lvlText w:val="■"/>
@@ -6974,7 +6970,7 @@
         <w:ind w:left="2160" w:hanging="360"/>
       </w:pPr>
     </w:lvl>
-    <w:lvl w:ilvl="3" w15:tentative="1">
+    <w:lvl w:ilvl="3" w:tentative="1">
       <w:start w:val="1"/>
       <w:numFmt w:val="bullet"/>
       <w:lvlText w:val="●"/>
@@ -6983,7 +6979,7 @@
         <w:ind w:left="2880" w:hanging="360"/>
       </w:pPr>
     </w:lvl>
-    <w:lvl w:ilvl="4" w15:tentative="1">
+    <w:lvl w:ilvl="4" w:tentative="1">
       <w:start w:val="1"/>
       <w:numFmt w:val="bullet"/>
       <w:lvlText w:val="○"/>
@@ -6992,7 +6988,7 @@
         <w:ind w:left="3600" w:hanging="360"/>
       </w:pPr>
     </w:lvl>
-    <w:lvl w:ilvl="5" w15:tentative="1">
+    <w:lvl w:ilvl="5" w:tentative="1">
       <w:start w:val="1"/>
       <w:numFmt w:val="bullet"/>
       <w:lvlText w:val="■"/>
@@ -7001,7 +6997,7 @@
         <w:ind w:left="4320" w:hanging="360"/>
       </w:pPr>
     </w:lvl>
-    <w:lvl w:ilvl="6" w15:tentative="1">
+    <w:lvl w:ilvl="6" w:tentative="1">
       <w:start w:val="1"/>
       <w:numFmt w:val="bullet"/>
       <w:lvlText w:val="●"/>
@@ -7010,7 +7006,7 @@
         <w:ind w:left="5040" w:hanging="360"/>
       </w:pPr>
     </w:lvl>
-    <w:lvl w:ilvl="7" w15:tentative="1">
+    <w:lvl w:ilvl="7" w:tentative="1">
       <w:start w:val="1"/>
       <w:numFmt w:val="bullet"/>
       <w:lvlText w:val="●"/>
@@ -7019,7 +7015,7 @@
         <w:ind w:left="5760" w:hanging="360"/>
       </w:pPr>
     </w:lvl>
-    <w:lvl w:ilvl="8" w15:tentative="1">
+    <w:lvl w:ilvl="8" w:tentative="1">
       <w:start w:val="1"/>
       <w:numFmt w:val="bullet"/>
       <w:lvlText w:val="●"/>
@@ -7044,6 +7040,10 @@
     <w:rPrDefault/>
     <w:pPrDefault/>
   </w:docDefaults>
+  <w:style w:type="paragraph" w:styleId="Normal" w:default="1">
+    <w:name w:val="Normal"/>
+    <w:qFormat/>
+  </w:style>
   <w:style w:type="paragraph" w:styleId="Title">
     <w:name w:val="Title"/>
     <w:basedOn w:val="Normal"/>
@@ -7216,4 +7216,294 @@
     </w:rPr>
   </w:style>
 </w:styles>
+</file>
+
+<file path=word/theme/theme1.xml><?xml version="1.0" encoding="utf-8"?>
+<a:theme xmlns:a="http://schemas.openxmlformats.org/drawingml/2006/main" name="Office Theme">
+  <a:themeElements>
+    <a:clrScheme name="Office">
+      <a:dk1>
+        <a:sysClr val="windowText" lastClr="000000"/>
+      </a:dk1>
+      <a:lt1>
+        <a:sysClr val="window" lastClr="FFFFFF"/>
+      </a:lt1>
+      <a:dk2>
+        <a:srgbClr val="44546A"/>
+      </a:dk2>
+      <a:lt2>
+        <a:srgbClr val="E7E6E6"/>
+      </a:lt2>
+      <a:accent1>
+        <a:srgbClr val="4472C4"/>
+      </a:accent1>
+      <a:accent2>
+        <a:srgbClr val="ED7D31"/>
+      </a:accent2>
+      <a:accent3>
+        <a:srgbClr val="A5A5A5"/>
+      </a:accent3>
+      <a:accent4>
+        <a:srgbClr val="FFC000"/>
+      </a:accent4>
+      <a:accent5>
+        <a:srgbClr val="5B9BD5"/>
+      </a:accent5>
+      <a:accent6>
+        <a:srgbClr val="70AD47"/>
+      </a:accent6>
+      <a:hlink>
+        <a:srgbClr val="0563C1"/>
+      </a:hlink>
+      <a:folHlink>
+        <a:srgbClr val="954F72"/>
+      </a:folHlink>
+    </a:clrScheme>
+    <a:fontScheme name="Office">
+      <a:majorFont>
+        <a:latin typeface="Calibri Light" panose="020F0302020204030204"/>
+        <a:ea typeface=""/>
+        <a:cs typeface=""/>
+        <a:font script="Jpan" typeface="游ゴシック Light"/>
+        <a:font script="Hang" typeface="맑은 고딕"/>
+        <a:font script="Hans" typeface="等线 Light"/>
+        <a:font script="Hant" typeface="新細明體"/>
+        <a:font script="Arab" typeface="Times New Roman"/>
+        <a:font script="Hebr" typeface="Times New Roman"/>
+        <a:font script="Thai" typeface="Angsana New"/>
+        <a:font script="Ethi" typeface="Nyala"/>
+        <a:font script="Beng" typeface="Vrinda"/>
+        <a:font script="Gujr" typeface="Shruti"/>
+        <a:font script="Khmr" typeface="MoolBoran"/>
+        <a:font script="Knda" typeface="Tunga"/>
+        <a:font script="Guru" typeface="Raavi"/>
+        <a:font script="Cans" typeface="Euphemia"/>
+        <a:font script="Cher" typeface="Plantagenet Cherokee"/>
+        <a:font script="Yiii" typeface="Microsoft Yi Baiti"/>
+        <a:font script="Tibt" typeface="Microsoft Himalaya"/>
+        <a:font script="Thaa" typeface="MV Boli"/>
+        <a:font script="Deva" typeface="Mangal"/>
+        <a:font script="Telu" typeface="Gautami"/>
+        <a:font script="Taml" typeface="Latha"/>
+        <a:font script="Syrc" typeface="Estrangelo Edessa"/>
+        <a:font script="Orya" typeface="Kalinga"/>
+        <a:font script="Mlym" typeface="Kartika"/>
+        <a:font script="Laoo" typeface="DokChampa"/>
+        <a:font script="Sinh" typeface="Iskoola Pota"/>
+        <a:font script="Mong" typeface="Mongolian Baiti"/>
+        <a:font script="Viet" typeface="Times New Roman"/>
+        <a:font script="Uigh" typeface="Microsoft Uighur"/>
+        <a:font script="Geor" typeface="Sylfaen"/>
+        <a:font script="Armn" typeface="Arial"/>
+        <a:font script="Bugi" typeface="Leelawadee UI"/>
+        <a:font script="Bopo" typeface="Microsoft JhengHei"/>
+        <a:font script="Java" typeface="Javanese Text"/>
+        <a:font script="Lisu" typeface="Segoe UI"/>
+        <a:font script="Mymr" typeface="Myanmar Text"/>
+        <a:font script="Nkoo" typeface="Ebrima"/>
+        <a:font script="Olck" typeface="Nirmala UI"/>
+        <a:font script="Osma" typeface="Ebrima"/>
+        <a:font script="Phag" typeface="Phagspa"/>
+        <a:font script="Syrn" typeface="Estrangelo Edessa"/>
+        <a:font script="Syrj" typeface="Estrangelo Edessa"/>
+        <a:font script="Syre" typeface="Estrangelo Edessa"/>
+        <a:font script="Sora" typeface="Nirmala UI"/>
+        <a:font script="Tale" typeface="Microsoft Tai Le"/>
+        <a:font script="Talu" typeface="Microsoft New Tai Lue"/>
+        <a:font script="Tfng" typeface="Ebrima"/>
+      </a:majorFont>
+      <a:minorFont>
+        <a:latin typeface="Calibri" panose="020F0502020204030204"/>
+        <a:ea typeface=""/>
+        <a:cs typeface=""/>
+        <a:font script="Jpan" typeface="游明朝"/>
+        <a:font script="Hang" typeface="맑은 고딕"/>
+        <a:font script="Hans" typeface="等线"/>
+        <a:font script="Hant" typeface="新細明體"/>
+        <a:font script="Arab" typeface="Arial"/>
+        <a:font script="Hebr" typeface="Arial"/>
+        <a:font script="Thai" typeface="Cordia New"/>
+        <a:font script="Ethi" typeface="Nyala"/>
+        <a:font script="Beng" typeface="Vrinda"/>
+        <a:font script="Gujr" typeface="Shruti"/>
+        <a:font script="Khmr" typeface="DaunPenh"/>
+        <a:font script="Knda" typeface="Tunga"/>
+        <a:font script="Guru" typeface="Raavi"/>
+        <a:font script="Cans" typeface="Euphemia"/>
+        <a:font script="Cher" typeface="Plantagenet Cherokee"/>
+        <a:font script="Yiii" typeface="Microsoft Yi Baiti"/>
+        <a:font script="Tibt" typeface="Microsoft Himalaya"/>
+        <a:font script="Thaa" typeface="MV Boli"/>
+        <a:font script="Deva" typeface="Mangal"/>
+        <a:font script="Telu" typeface="Gautami"/>
+        <a:font script="Taml" typeface="Latha"/>
+        <a:font script="Syrc" typeface="Estrangelo Edessa"/>
+        <a:font script="Orya" typeface="Kalinga"/>
+        <a:font script="Mlym" typeface="Kartika"/>
+        <a:font script="Laoo" typeface="DokChampa"/>
+        <a:font script="Sinh" typeface="Iskoola Pota"/>
+        <a:font script="Mong" typeface="Mongolian Baiti"/>
+        <a:font script="Viet" typeface="Arial"/>
+        <a:font script="Uigh" typeface="Microsoft Uighur"/>
+        <a:font script="Geor" typeface="Sylfaen"/>
+        <a:font script="Armn" typeface="Arial"/>
+        <a:font script="Bugi" typeface="Leelawadee UI"/>
+        <a:font script="Bopo" typeface="Microsoft JhengHei"/>
+        <a:font script="Java" typeface="Javanese Text"/>
+        <a:font script="Lisu" typeface="Segoe UI"/>
+        <a:font script="Mymr" typeface="Myanmar Text"/>
+        <a:font script="Nkoo" typeface="Ebrima"/>
+        <a:font script="Olck" typeface="Nirmala UI"/>
+        <a:font script="Osma" typeface="Ebrima"/>
+        <a:font script="Phag" typeface="Phagspa"/>
+        <a:font script="Syrn" typeface="Estrangelo Edessa"/>
+        <a:font script="Syrj" typeface="Estrangelo Edessa"/>
+        <a:font script="Syre" typeface="Estrangelo Edessa"/>
+        <a:font script="Sora" typeface="Nirmala UI"/>
+        <a:font script="Tale" typeface="Microsoft Tai Le"/>
+        <a:font script="Talu" typeface="Microsoft New Tai Lue"/>
+        <a:font script="Tfng" typeface="Ebrima"/>
+      </a:minorFont>
+    </a:fontScheme>
+    <a:fmtScheme name="Office">
+      <a:fillStyleLst>
+        <a:solidFill>
+          <a:schemeClr val="phClr"/>
+        </a:solidFill>
+        <a:gradFill rotWithShape="true">
+          <a:gsLst>
+            <a:gs pos="0">
+              <a:schemeClr val="phClr">
+                <a:lumMod val="110000"/>
+                <a:satMod val="105000"/>
+                <a:tint val="67000"/>
+              </a:schemeClr>
+            </a:gs>
+            <a:gs pos="50000">
+              <a:schemeClr val="phClr">
+                <a:lumMod val="105000"/>
+                <a:satMod val="103000"/>
+                <a:tint val="73000"/>
+              </a:schemeClr>
+            </a:gs>
+            <a:gs pos="100000">
+              <a:schemeClr val="phClr">
+                <a:lumMod val="105000"/>
+                <a:satMod val="109000"/>
+                <a:tint val="81000"/>
+              </a:schemeClr>
+            </a:gs>
+          </a:gsLst>
+          <a:lin ang="5400000" scaled="false"/>
+        </a:gradFill>
+        <a:gradFill rotWithShape="true">
+          <a:gsLst>
+            <a:gs pos="0">
+              <a:schemeClr val="phClr">
+                <a:satMod val="103000"/>
+                <a:lumMod val="102000"/>
+                <a:tint val="94000"/>
+              </a:schemeClr>
+            </a:gs>
+            <a:gs pos="50000">
+              <a:schemeClr val="phClr">
+                <a:satMod val="110000"/>
+                <a:lumMod val="100000"/>
+                <a:shade val="100000"/>
+              </a:schemeClr>
+            </a:gs>
+            <a:gs pos="100000">
+              <a:schemeClr val="phClr">
+                <a:lumMod val="99000"/>
+                <a:satMod val="120000"/>
+                <a:shade val="78000"/>
+              </a:schemeClr>
+            </a:gs>
+          </a:gsLst>
+          <a:lin ang="5400000" scaled="false"/>
+        </a:gradFill>
+      </a:fillStyleLst>
+      <a:lnStyleLst>
+        <a:ln w="6350" cap="flat" cmpd="sng" algn="ctr">
+          <a:solidFill>
+            <a:schemeClr val="phClr"/>
+          </a:solidFill>
+          <a:prstDash val="solid"/>
+          <a:miter lim="800000"/>
+        </a:ln>
+        <a:ln w="12700" cap="flat" cmpd="sng" algn="ctr">
+          <a:solidFill>
+            <a:schemeClr val="phClr"/>
+          </a:solidFill>
+          <a:prstDash val="solid"/>
+          <a:miter lim="800000"/>
+        </a:ln>
+        <a:ln w="19050" cap="flat" cmpd="sng" algn="ctr">
+          <a:solidFill>
+            <a:schemeClr val="phClr"/>
+          </a:solidFill>
+          <a:prstDash val="solid"/>
+          <a:miter lim="800000"/>
+        </a:ln>
+      </a:lnStyleLst>
+      <a:effectStyleLst>
+        <a:effectStyle>
+          <a:effectLst/>
+        </a:effectStyle>
+        <a:effectStyle>
+          <a:effectLst/>
+        </a:effectStyle>
+        <a:effectStyle>
+          <a:effectLst>
+            <a:outerShdw blurRad="57150" dist="19050" dir="5400000" algn="ctr" rotWithShape="false">
+              <a:srgbClr val="000000">
+                <a:alpha val="63000"/>
+              </a:srgbClr>
+            </a:outerShdw>
+          </a:effectLst>
+        </a:effectStyle>
+      </a:effectStyleLst>
+      <a:bgFillStyleLst>
+        <a:solidFill>
+          <a:schemeClr val="phClr"/>
+        </a:solidFill>
+        <a:solidFill>
+          <a:schemeClr val="phClr">
+            <a:tint val="95000"/>
+            <a:satMod val="170000"/>
+          </a:schemeClr>
+        </a:solidFill>
+        <a:gradFill rotWithShape="true">
+          <a:gsLst>
+            <a:gs pos="0">
+              <a:schemeClr val="phClr">
+                <a:tint val="93000"/>
+                <a:satMod val="150000"/>
+                <a:shade val="98000"/>
+                <a:lumMod val="102000"/>
+              </a:schemeClr>
+            </a:gs>
+            <a:gs pos="50000">
+              <a:schemeClr val="phClr">
+                <a:tint val="98000"/>
+                <a:satMod val="130000"/>
+                <a:shade val="90000"/>
+                <a:lumMod val="103000"/>
+              </a:schemeClr>
+            </a:gs>
+            <a:gs pos="100000">
+              <a:schemeClr val="phClr">
+                <a:shade val="63000"/>
+                <a:satMod val="120000"/>
+              </a:schemeClr>
+            </a:gs>
+          </a:gsLst>
+          <a:lin ang="5400000" scaled="false"/>
+        </a:gradFill>
+      </a:bgFillStyleLst>
+    </a:fmtScheme>
+  </a:themeElements>
+  <a:objectDefaults/>
+  <a:extraClrSchemeLst/>
+</a:theme>
 </file>
</xml_diff>